<commit_message>
docs: Bo sung du toan chi phi tu van trien khai tron goi 15 trieu dong vao ban thuyet minh Word va PDF
</commit_message>
<xml_diff>
--- a/QAROMI_ERP_Thuyet_Minh_Giai_Phap.docx
+++ b/QAROMI_ERP_Thuyet_Minh_Giai_Phap.docx
@@ -45,7 +45,7 @@
           <w:color w:val="0284C7"/>
           <w:sz w:val="22"/>
         </w:rPr>
-        <w:t>Tài liệu thuyết minh tính năng, kiến trúc kỹ thuật và minh chứng giao diện thực tế (23 phân hệ)</w:t>
+        <w:t>Tài liệu thuyết minh tính năng, kiến trúc kỹ thuật, dự toán kinh phí và minh chứng giao diện thực tế (23 phân hệ)</w:t>
         <w:br/>
         <w:t>Phục vụ thẩm định, phê duyệt và chốt phương án triển khai</w:t>
       </w:r>
@@ -260,6 +260,52 @@
                 <w:color w:val="1E3A8A"/>
                 <w:sz w:val="19"/>
               </w:rPr>
+              <w:t>Chi phí tư vấn triển khai:</w:t>
+            </w:r>
+          </w:p>
+        </w:tc>
+        <w:tc>
+          <w:tcPr>
+            <w:tcW w:type="dxa" w:w="4802"/>
+            <w:shd w:fill="F8FAFC"/>
+            <w:tcMar>
+              <w:top w:w="80" w:type="dxa"/>
+              <w:bottom w:w="80" w:type="dxa"/>
+              <w:left w:w="120" w:type="dxa"/>
+              <w:right w:w="120" w:type="dxa"/>
+            </w:tcMar>
+          </w:tcPr>
+          <w:p>
+            <w:r>
+              <w:rPr>
+                <w:b/>
+                <w:color w:val="DC2626"/>
+                <w:sz w:val="19"/>
+              </w:rPr>
+              <w:t>15.000.000 VNĐ (Mười lăm triệu đồng chẵn — Trọn gói chìa khóa trao tay)</w:t>
+            </w:r>
+          </w:p>
+        </w:tc>
+      </w:tr>
+      <w:tr>
+        <w:tc>
+          <w:tcPr>
+            <w:tcW w:type="dxa" w:w="4802"/>
+            <w:shd w:fill="F1F5F9"/>
+            <w:tcMar>
+              <w:top w:w="80" w:type="dxa"/>
+              <w:bottom w:w="80" w:type="dxa"/>
+              <w:left w:w="120" w:type="dxa"/>
+              <w:right w:w="120" w:type="dxa"/>
+            </w:tcMar>
+          </w:tcPr>
+          <w:p>
+            <w:r>
+              <w:rPr>
+                <w:b/>
+                <w:color w:val="1E3A8A"/>
+                <w:sz w:val="19"/>
+              </w:rPr>
               <w:t>Phiên bản hồ sơ:</w:t>
             </w:r>
           </w:p>
@@ -281,7 +327,7 @@
                 <w:color w:val="0F172A"/>
                 <w:sz w:val="19"/>
               </w:rPr>
-              <w:t>Phiên bản 2.0.0 — Bản Thuyết Minh Chi Tiết Kèm Ảnh Minh Chứng Giao Diện</w:t>
+              <w:t>Phiên bản 2.1.0 — Bản Trình Duyệt Chốt Phương Án (Kèm 23 ảnh minh chứng &amp; Dự toán)</w:t>
             </w:r>
           </w:p>
         </w:tc>
@@ -761,7 +807,7 @@
           <w:color w:val="0F172A"/>
           <w:sz w:val="20"/>
         </w:rPr>
-        <w:t>Bộ máy gom tụ các sự vụ tồn đọng cần hành động ngay, phân loại theo độ khẩn cấp (Cao - Trung bình - Thông tin), giúp nhân sự không bao giờ bị quên việc hay chậm trễ phục vụ khách hàng.</w:t>
+        <w:t>Bộ máy gom tụ các sự vụ tồn đọng cần hành động ngay, phân loại theo độ khẩn cấp (Đơn hàng chờ giao, Đơn chưa nộp tiền COD, Cảnh báo tồn kho tiếp ứng), giúp nhân sự không bao giờ bị quên việc hay chậm trễ phục vụ khách hàng.</w:t>
       </w:r>
     </w:p>
     <w:p>
@@ -782,7 +828,7 @@
           <w:color w:val="0F172A"/>
           <w:sz w:val="20"/>
         </w:rPr>
-        <w:t>Quét liên tục các trạng thái nghiệp vụ chưa hoàn tất: 32 đơn hàng đã giao nhưng chưa xuất hóa đơn VAT điện tử, các đại lý nợ vỏ bình quá 15 ngày chưa thu hồi, các trạm kho sắp chạm ngưỡng tồn an toàn (dưới 20 bình) và các ca bảo vệ chưa xác nhận chấm công.</w:t>
+        <w:t>Quét liên tục các trạng thái nghiệp vụ chưa hoàn tất: 15 đơn hàng chưa nộp tiền quỹ COD (tổng nợ 59.094.000 đ), các trạm kho sắp chạm ngưỡng tồn an toàn (dưới 20 bình) và tự động sinh nút đôn đốc nộp tiền và tạo lệnh tiếp ứng kho.</w:t>
       </w:r>
     </w:p>
     <w:p>
@@ -803,7 +849,7 @@
           <w:color w:val="0F172A"/>
           <w:sz w:val="20"/>
         </w:rPr>
-        <w:t>Nhân viên mở máy là thấy ngay danh sách việc phải làm hôm nay. Kế toán xử lý nhanh 32 đơn cần xuất HĐ bằng 1 cú click chuột, Thủ kho thấy ngay cảnh báo tiếp ứng kho, giảm thiểu 100% tình trạng sót việc và trễ hạn hợp đồng.</w:t>
+        <w:t>Nhân viên mở máy là thấy ngay danh sách việc phải làm hôm nay. Kế toán xử lý nhanh các khoản nợ tiền quỹ, Thủ kho thấy ngay cảnh báo tiếp ứng kho, giảm thiểu 100% tình trạng đọng vốn và thiếu hụt hàng hóa.</w:t>
       </w:r>
     </w:p>
     <w:p>
@@ -3568,7 +3614,7 @@
           <w:color w:val="1E3A8A"/>
           <w:sz w:val="28"/>
         </w:rPr>
-        <w:t>PHẦN III: LỘ TRÌNH TRIỂN KHAI &amp; CAM KẾT DỊCH VỤ</w:t>
+        <w:t>PHẦN III: LỘ TRÌNH TRIỂN KHAI &amp; DỰ TOÁN KINH PHÍ TƯ VẤN</w:t>
       </w:r>
     </w:p>
     <w:p>
@@ -3680,7 +3726,799 @@
           <w:color w:val="0284C7"/>
           <w:sz w:val="24"/>
         </w:rPr>
-        <w:t>2. Cam kết chất lượng, bảo mật &amp; hỗ trợ kỹ thuật</w:t>
+        <w:t>2. Dự toán kinh phí tư vấn và triển khai giải pháp (15.000.000 VNĐ)</w:t>
+      </w:r>
+    </w:p>
+    <w:p>
+      <w:pPr>
+        <w:spacing w:after="80" w:line="276" w:lineRule="auto"/>
+      </w:pPr>
+      <w:r>
+        <w:rPr>
+          <w:i w:val="0"/>
+          <w:color w:val="0F172A"/>
+          <w:sz w:val="20"/>
+        </w:rPr>
+        <w:t>Chi phí tư vấn và triển khai phần mềm Quản trị doanh nghiệp QAROMI ERP được xây dựng theo hình thức trọn gói chìa khóa trao tay, bảo đảm tối ưu ngân sách cho xí nghiệp và tuyệt đối không phát sinh chi phí ẩn:</w:t>
+      </w:r>
+    </w:p>
+    <w:tbl>
+      <w:tblPr>
+        <w:tblW w:type="auto" w:w="0"/>
+        <w:jc w:val="center"/>
+        <w:tblLayout w:type="fixed"/>
+        <w:tblLook w:firstColumn="1" w:firstRow="1" w:lastColumn="0" w:lastRow="0" w:noHBand="0" w:noVBand="1" w:val="04A0"/>
+      </w:tblPr>
+      <w:tblGrid>
+        <w:gridCol w:w="864"/>
+        <w:gridCol w:w="3744"/>
+        <w:gridCol w:w="2592"/>
+        <w:gridCol w:w="864"/>
+        <w:gridCol w:w="1728"/>
+      </w:tblGrid>
+      <w:tr>
+        <w:tc>
+          <w:tcPr>
+            <w:tcW w:type="dxa" w:w="1921"/>
+            <w:shd w:fill="1E3A8A"/>
+            <w:tcMar>
+              <w:top w:w="100" w:type="dxa"/>
+              <w:bottom w:w="100" w:type="dxa"/>
+              <w:left w:w="100" w:type="dxa"/>
+              <w:right w:w="100" w:type="dxa"/>
+            </w:tcMar>
+          </w:tcPr>
+          <w:p>
+            <w:pPr>
+              <w:jc w:val="center"/>
+            </w:pPr>
+            <w:r>
+              <w:rPr>
+                <w:b/>
+                <w:color w:val="FFFFFF"/>
+                <w:sz w:val="18"/>
+              </w:rPr>
+              <w:t>STT</w:t>
+            </w:r>
+          </w:p>
+        </w:tc>
+        <w:tc>
+          <w:tcPr>
+            <w:tcW w:type="dxa" w:w="1921"/>
+            <w:shd w:fill="1E3A8A"/>
+            <w:tcMar>
+              <w:top w:w="100" w:type="dxa"/>
+              <w:bottom w:w="100" w:type="dxa"/>
+              <w:left w:w="100" w:type="dxa"/>
+              <w:right w:w="100" w:type="dxa"/>
+            </w:tcMar>
+          </w:tcPr>
+          <w:p>
+            <w:r>
+              <w:rPr>
+                <w:b/>
+                <w:color w:val="FFFFFF"/>
+                <w:sz w:val="18"/>
+              </w:rPr>
+              <w:t>Hạng mục công việc tư vấn &amp; triển khai</w:t>
+            </w:r>
+          </w:p>
+        </w:tc>
+        <w:tc>
+          <w:tcPr>
+            <w:tcW w:type="dxa" w:w="1921"/>
+            <w:shd w:fill="1E3A8A"/>
+            <w:tcMar>
+              <w:top w:w="100" w:type="dxa"/>
+              <w:bottom w:w="100" w:type="dxa"/>
+              <w:left w:w="100" w:type="dxa"/>
+              <w:right w:w="100" w:type="dxa"/>
+            </w:tcMar>
+          </w:tcPr>
+          <w:p>
+            <w:r>
+              <w:rPr>
+                <w:b/>
+                <w:color w:val="FFFFFF"/>
+                <w:sz w:val="18"/>
+              </w:rPr>
+              <w:t>Phạm vi thực hiện</w:t>
+            </w:r>
+          </w:p>
+        </w:tc>
+        <w:tc>
+          <w:tcPr>
+            <w:tcW w:type="dxa" w:w="1921"/>
+            <w:shd w:fill="1E3A8A"/>
+            <w:tcMar>
+              <w:top w:w="100" w:type="dxa"/>
+              <w:bottom w:w="100" w:type="dxa"/>
+              <w:left w:w="100" w:type="dxa"/>
+              <w:right w:w="100" w:type="dxa"/>
+            </w:tcMar>
+          </w:tcPr>
+          <w:p>
+            <w:pPr>
+              <w:jc w:val="center"/>
+            </w:pPr>
+            <w:r>
+              <w:rPr>
+                <w:b/>
+                <w:color w:val="FFFFFF"/>
+                <w:sz w:val="18"/>
+              </w:rPr>
+              <w:t>ĐVT</w:t>
+            </w:r>
+          </w:p>
+        </w:tc>
+        <w:tc>
+          <w:tcPr>
+            <w:tcW w:type="dxa" w:w="1921"/>
+            <w:shd w:fill="1E3A8A"/>
+            <w:tcMar>
+              <w:top w:w="100" w:type="dxa"/>
+              <w:bottom w:w="100" w:type="dxa"/>
+              <w:left w:w="100" w:type="dxa"/>
+              <w:right w:w="100" w:type="dxa"/>
+            </w:tcMar>
+          </w:tcPr>
+          <w:p>
+            <w:pPr>
+              <w:jc w:val="right"/>
+            </w:pPr>
+            <w:r>
+              <w:rPr>
+                <w:b/>
+                <w:color w:val="FFFFFF"/>
+                <w:sz w:val="18"/>
+              </w:rPr>
+              <w:t>Thành tiền (VNĐ)</w:t>
+            </w:r>
+          </w:p>
+        </w:tc>
+      </w:tr>
+      <w:tr>
+        <w:tc>
+          <w:tcPr>
+            <w:tcW w:type="dxa" w:w="1921"/>
+            <w:shd w:fill="F8FAFC"/>
+            <w:tcMar>
+              <w:top w:w="80" w:type="dxa"/>
+              <w:bottom w:w="80" w:type="dxa"/>
+              <w:left w:w="100" w:type="dxa"/>
+              <w:right w:w="100" w:type="dxa"/>
+            </w:tcMar>
+          </w:tcPr>
+          <w:p>
+            <w:pPr>
+              <w:jc w:val="center"/>
+            </w:pPr>
+            <w:r>
+              <w:rPr>
+                <w:color w:val="0F172A"/>
+                <w:sz w:val="18"/>
+              </w:rPr>
+              <w:t>1</w:t>
+            </w:r>
+          </w:p>
+        </w:tc>
+        <w:tc>
+          <w:tcPr>
+            <w:tcW w:type="dxa" w:w="1921"/>
+            <w:shd w:fill="F8FAFC"/>
+            <w:tcMar>
+              <w:top w:w="80" w:type="dxa"/>
+              <w:bottom w:w="80" w:type="dxa"/>
+              <w:left w:w="100" w:type="dxa"/>
+              <w:right w:w="100" w:type="dxa"/>
+            </w:tcMar>
+          </w:tcPr>
+          <w:p>
+            <w:r>
+              <w:rPr>
+                <w:color w:val="0F172A"/>
+                <w:sz w:val="18"/>
+              </w:rPr>
+              <w:t>Khảo sát hiện trạng &amp; Chuẩn hóa dữ liệu Master Data từ Excel</w:t>
+            </w:r>
+          </w:p>
+        </w:tc>
+        <w:tc>
+          <w:tcPr>
+            <w:tcW w:type="dxa" w:w="1921"/>
+            <w:shd w:fill="F8FAFC"/>
+            <w:tcMar>
+              <w:top w:w="80" w:type="dxa"/>
+              <w:bottom w:w="80" w:type="dxa"/>
+              <w:left w:w="100" w:type="dxa"/>
+              <w:right w:w="100" w:type="dxa"/>
+            </w:tcMar>
+          </w:tcPr>
+          <w:p>
+            <w:r>
+              <w:rPr>
+                <w:color w:val="0F172A"/>
+                <w:sz w:val="18"/>
+              </w:rPr>
+              <w:t>Bóc tách 13 sheets dữ liệu thực tế, xử lý triệt để 12 lỗi #REF!, làm sạch danh bạ 411 khách hàng, 202 CBCNV, 5 kho bãi</w:t>
+            </w:r>
+          </w:p>
+        </w:tc>
+        <w:tc>
+          <w:tcPr>
+            <w:tcW w:type="dxa" w:w="1921"/>
+            <w:shd w:fill="F8FAFC"/>
+            <w:tcMar>
+              <w:top w:w="80" w:type="dxa"/>
+              <w:bottom w:w="80" w:type="dxa"/>
+              <w:left w:w="100" w:type="dxa"/>
+              <w:right w:w="100" w:type="dxa"/>
+            </w:tcMar>
+          </w:tcPr>
+          <w:p>
+            <w:pPr>
+              <w:jc w:val="center"/>
+            </w:pPr>
+            <w:r>
+              <w:rPr>
+                <w:color w:val="0F172A"/>
+                <w:sz w:val="18"/>
+              </w:rPr>
+              <w:t>Gói</w:t>
+            </w:r>
+          </w:p>
+        </w:tc>
+        <w:tc>
+          <w:tcPr>
+            <w:tcW w:type="dxa" w:w="1921"/>
+            <w:shd w:fill="F8FAFC"/>
+            <w:tcMar>
+              <w:top w:w="80" w:type="dxa"/>
+              <w:bottom w:w="80" w:type="dxa"/>
+              <w:left w:w="100" w:type="dxa"/>
+              <w:right w:w="100" w:type="dxa"/>
+            </w:tcMar>
+          </w:tcPr>
+          <w:p>
+            <w:pPr>
+              <w:jc w:val="right"/>
+            </w:pPr>
+            <w:r>
+              <w:rPr>
+                <w:b/>
+                <w:color w:val="1E3A8A"/>
+                <w:sz w:val="18"/>
+              </w:rPr>
+              <w:t>3.500.000</w:t>
+            </w:r>
+          </w:p>
+        </w:tc>
+      </w:tr>
+      <w:tr>
+        <w:tc>
+          <w:tcPr>
+            <w:tcW w:type="dxa" w:w="1921"/>
+            <w:shd w:fill="FFFFFF"/>
+            <w:tcMar>
+              <w:top w:w="80" w:type="dxa"/>
+              <w:bottom w:w="80" w:type="dxa"/>
+              <w:left w:w="100" w:type="dxa"/>
+              <w:right w:w="100" w:type="dxa"/>
+            </w:tcMar>
+          </w:tcPr>
+          <w:p>
+            <w:pPr>
+              <w:jc w:val="center"/>
+            </w:pPr>
+            <w:r>
+              <w:rPr>
+                <w:color w:val="0F172A"/>
+                <w:sz w:val="18"/>
+              </w:rPr>
+              <w:t>2</w:t>
+            </w:r>
+          </w:p>
+        </w:tc>
+        <w:tc>
+          <w:tcPr>
+            <w:tcW w:type="dxa" w:w="1921"/>
+            <w:shd w:fill="FFFFFF"/>
+            <w:tcMar>
+              <w:top w:w="80" w:type="dxa"/>
+              <w:bottom w:w="80" w:type="dxa"/>
+              <w:left w:w="100" w:type="dxa"/>
+              <w:right w:w="100" w:type="dxa"/>
+            </w:tcMar>
+          </w:tcPr>
+          <w:p>
+            <w:r>
+              <w:rPr>
+                <w:color w:val="0F172A"/>
+                <w:sz w:val="18"/>
+              </w:rPr>
+              <w:t>Cài đặt hệ thống lõi &amp; Cấu hình 23 phân hệ QAROMI ERP</w:t>
+            </w:r>
+          </w:p>
+        </w:tc>
+        <w:tc>
+          <w:tcPr>
+            <w:tcW w:type="dxa" w:w="1921"/>
+            <w:shd w:fill="FFFFFF"/>
+            <w:tcMar>
+              <w:top w:w="80" w:type="dxa"/>
+              <w:bottom w:w="80" w:type="dxa"/>
+              <w:left w:w="100" w:type="dxa"/>
+              <w:right w:w="100" w:type="dxa"/>
+            </w:tcMar>
+          </w:tcPr>
+          <w:p>
+            <w:r>
+              <w:rPr>
+                <w:color w:val="0F172A"/>
+                <w:sz w:val="18"/>
+              </w:rPr>
+              <w:t>Thiết lập CSDL quan hệ ACID, đóng gói logic tự động trừ kho, công thức chia đều thù lao vận chuyển, tách VAT 8%, sổ nợ vỏ 19L</w:t>
+            </w:r>
+          </w:p>
+        </w:tc>
+        <w:tc>
+          <w:tcPr>
+            <w:tcW w:type="dxa" w:w="1921"/>
+            <w:shd w:fill="FFFFFF"/>
+            <w:tcMar>
+              <w:top w:w="80" w:type="dxa"/>
+              <w:bottom w:w="80" w:type="dxa"/>
+              <w:left w:w="100" w:type="dxa"/>
+              <w:right w:w="100" w:type="dxa"/>
+            </w:tcMar>
+          </w:tcPr>
+          <w:p>
+            <w:pPr>
+              <w:jc w:val="center"/>
+            </w:pPr>
+            <w:r>
+              <w:rPr>
+                <w:color w:val="0F172A"/>
+                <w:sz w:val="18"/>
+              </w:rPr>
+              <w:t>Gói</w:t>
+            </w:r>
+          </w:p>
+        </w:tc>
+        <w:tc>
+          <w:tcPr>
+            <w:tcW w:type="dxa" w:w="1921"/>
+            <w:shd w:fill="FFFFFF"/>
+            <w:tcMar>
+              <w:top w:w="80" w:type="dxa"/>
+              <w:bottom w:w="80" w:type="dxa"/>
+              <w:left w:w="100" w:type="dxa"/>
+              <w:right w:w="100" w:type="dxa"/>
+            </w:tcMar>
+          </w:tcPr>
+          <w:p>
+            <w:pPr>
+              <w:jc w:val="right"/>
+            </w:pPr>
+            <w:r>
+              <w:rPr>
+                <w:b/>
+                <w:color w:val="1E3A8A"/>
+                <w:sz w:val="18"/>
+              </w:rPr>
+              <w:t>5.500.000</w:t>
+            </w:r>
+          </w:p>
+        </w:tc>
+      </w:tr>
+      <w:tr>
+        <w:tc>
+          <w:tcPr>
+            <w:tcW w:type="dxa" w:w="1921"/>
+            <w:shd w:fill="F8FAFC"/>
+            <w:tcMar>
+              <w:top w:w="80" w:type="dxa"/>
+              <w:bottom w:w="80" w:type="dxa"/>
+              <w:left w:w="100" w:type="dxa"/>
+              <w:right w:w="100" w:type="dxa"/>
+            </w:tcMar>
+          </w:tcPr>
+          <w:p>
+            <w:pPr>
+              <w:jc w:val="center"/>
+            </w:pPr>
+            <w:r>
+              <w:rPr>
+                <w:color w:val="0F172A"/>
+                <w:sz w:val="18"/>
+              </w:rPr>
+              <w:t>3</w:t>
+            </w:r>
+          </w:p>
+        </w:tc>
+        <w:tc>
+          <w:tcPr>
+            <w:tcW w:type="dxa" w:w="1921"/>
+            <w:shd w:fill="F8FAFC"/>
+            <w:tcMar>
+              <w:top w:w="80" w:type="dxa"/>
+              <w:bottom w:w="80" w:type="dxa"/>
+              <w:left w:w="100" w:type="dxa"/>
+              <w:right w:w="100" w:type="dxa"/>
+            </w:tcMar>
+          </w:tcPr>
+          <w:p>
+            <w:r>
+              <w:rPr>
+                <w:color w:val="0F172A"/>
+                <w:sz w:val="18"/>
+              </w:rPr>
+              <w:t>Đào tạo chuyển giao công nghệ &amp; Vận hành thử nghiệm (UAT)</w:t>
+            </w:r>
+          </w:p>
+        </w:tc>
+        <w:tc>
+          <w:tcPr>
+            <w:tcW w:type="dxa" w:w="1921"/>
+            <w:shd w:fill="F8FAFC"/>
+            <w:tcMar>
+              <w:top w:w="80" w:type="dxa"/>
+              <w:bottom w:w="80" w:type="dxa"/>
+              <w:left w:w="100" w:type="dxa"/>
+              <w:right w:w="100" w:type="dxa"/>
+            </w:tcMar>
+          </w:tcPr>
+          <w:p>
+            <w:r>
+              <w:rPr>
+                <w:color w:val="0F172A"/>
+                <w:sz w:val="18"/>
+              </w:rPr>
+              <w:t>Đào tạo thực chiến Ban Giám đốc, Kế toán, Thủ kho, Tiếp thị, Tài xế xe tải điện; hỗ trợ chạy song song 14 ngày</w:t>
+            </w:r>
+          </w:p>
+        </w:tc>
+        <w:tc>
+          <w:tcPr>
+            <w:tcW w:type="dxa" w:w="1921"/>
+            <w:shd w:fill="F8FAFC"/>
+            <w:tcMar>
+              <w:top w:w="80" w:type="dxa"/>
+              <w:bottom w:w="80" w:type="dxa"/>
+              <w:left w:w="100" w:type="dxa"/>
+              <w:right w:w="100" w:type="dxa"/>
+            </w:tcMar>
+          </w:tcPr>
+          <w:p>
+            <w:pPr>
+              <w:jc w:val="center"/>
+            </w:pPr>
+            <w:r>
+              <w:rPr>
+                <w:color w:val="0F172A"/>
+                <w:sz w:val="18"/>
+              </w:rPr>
+              <w:t>Gói</w:t>
+            </w:r>
+          </w:p>
+        </w:tc>
+        <w:tc>
+          <w:tcPr>
+            <w:tcW w:type="dxa" w:w="1921"/>
+            <w:shd w:fill="F8FAFC"/>
+            <w:tcMar>
+              <w:top w:w="80" w:type="dxa"/>
+              <w:bottom w:w="80" w:type="dxa"/>
+              <w:left w:w="100" w:type="dxa"/>
+              <w:right w:w="100" w:type="dxa"/>
+            </w:tcMar>
+          </w:tcPr>
+          <w:p>
+            <w:pPr>
+              <w:jc w:val="right"/>
+            </w:pPr>
+            <w:r>
+              <w:rPr>
+                <w:b/>
+                <w:color w:val="1E3A8A"/>
+                <w:sz w:val="18"/>
+              </w:rPr>
+              <w:t>3.500.000</w:t>
+            </w:r>
+          </w:p>
+        </w:tc>
+      </w:tr>
+      <w:tr>
+        <w:tc>
+          <w:tcPr>
+            <w:tcW w:type="dxa" w:w="1921"/>
+            <w:shd w:fill="FFFFFF"/>
+            <w:tcMar>
+              <w:top w:w="80" w:type="dxa"/>
+              <w:bottom w:w="80" w:type="dxa"/>
+              <w:left w:w="100" w:type="dxa"/>
+              <w:right w:w="100" w:type="dxa"/>
+            </w:tcMar>
+          </w:tcPr>
+          <w:p>
+            <w:pPr>
+              <w:jc w:val="center"/>
+            </w:pPr>
+            <w:r>
+              <w:rPr>
+                <w:color w:val="0F172A"/>
+                <w:sz w:val="18"/>
+              </w:rPr>
+              <w:t>4</w:t>
+            </w:r>
+          </w:p>
+        </w:tc>
+        <w:tc>
+          <w:tcPr>
+            <w:tcW w:type="dxa" w:w="1921"/>
+            <w:shd w:fill="FFFFFF"/>
+            <w:tcMar>
+              <w:top w:w="80" w:type="dxa"/>
+              <w:bottom w:w="80" w:type="dxa"/>
+              <w:left w:w="100" w:type="dxa"/>
+              <w:right w:w="100" w:type="dxa"/>
+            </w:tcMar>
+          </w:tcPr>
+          <w:p>
+            <w:r>
+              <w:rPr>
+                <w:color w:val="0F172A"/>
+                <w:sz w:val="18"/>
+              </w:rPr>
+              <w:t>Bảo hành, bảo trì &amp; Hỗ trợ kỹ thuật sau Golive (06 tháng)</w:t>
+            </w:r>
+          </w:p>
+        </w:tc>
+        <w:tc>
+          <w:tcPr>
+            <w:tcW w:type="dxa" w:w="1921"/>
+            <w:shd w:fill="FFFFFF"/>
+            <w:tcMar>
+              <w:top w:w="80" w:type="dxa"/>
+              <w:bottom w:w="80" w:type="dxa"/>
+              <w:left w:w="100" w:type="dxa"/>
+              <w:right w:w="100" w:type="dxa"/>
+            </w:tcMar>
+          </w:tcPr>
+          <w:p>
+            <w:r>
+              <w:rPr>
+                <w:color w:val="0F172A"/>
+                <w:sz w:val="18"/>
+              </w:rPr>
+              <w:t>Trực hỗ trợ kỹ thuật 24/7, định kỳ sao lưu dữ liệu, bảo đảm hệ thống vận hành thông suốt, chuyển giao tài liệu kỹ thuật</w:t>
+            </w:r>
+          </w:p>
+        </w:tc>
+        <w:tc>
+          <w:tcPr>
+            <w:tcW w:type="dxa" w:w="1921"/>
+            <w:shd w:fill="FFFFFF"/>
+            <w:tcMar>
+              <w:top w:w="80" w:type="dxa"/>
+              <w:bottom w:w="80" w:type="dxa"/>
+              <w:left w:w="100" w:type="dxa"/>
+              <w:right w:w="100" w:type="dxa"/>
+            </w:tcMar>
+          </w:tcPr>
+          <w:p>
+            <w:pPr>
+              <w:jc w:val="center"/>
+            </w:pPr>
+            <w:r>
+              <w:rPr>
+                <w:color w:val="0F172A"/>
+                <w:sz w:val="18"/>
+              </w:rPr>
+              <w:t>Gói</w:t>
+            </w:r>
+          </w:p>
+        </w:tc>
+        <w:tc>
+          <w:tcPr>
+            <w:tcW w:type="dxa" w:w="1921"/>
+            <w:shd w:fill="FFFFFF"/>
+            <w:tcMar>
+              <w:top w:w="80" w:type="dxa"/>
+              <w:bottom w:w="80" w:type="dxa"/>
+              <w:left w:w="100" w:type="dxa"/>
+              <w:right w:w="100" w:type="dxa"/>
+            </w:tcMar>
+          </w:tcPr>
+          <w:p>
+            <w:pPr>
+              <w:jc w:val="right"/>
+            </w:pPr>
+            <w:r>
+              <w:rPr>
+                <w:b/>
+                <w:color w:val="1E3A8A"/>
+                <w:sz w:val="18"/>
+              </w:rPr>
+              <w:t>2.500.000</w:t>
+            </w:r>
+          </w:p>
+        </w:tc>
+      </w:tr>
+      <w:tr>
+        <w:tc>
+          <w:tcPr>
+            <w:tcW w:type="dxa" w:w="1921"/>
+            <w:shd w:fill="EFF6FF"/>
+            <w:tcMar>
+              <w:top w:w="100" w:type="dxa"/>
+              <w:bottom w:w="100" w:type="dxa"/>
+              <w:left w:w="100" w:type="dxa"/>
+              <w:right w:w="100" w:type="dxa"/>
+            </w:tcMar>
+          </w:tcPr>
+          <w:p/>
+        </w:tc>
+        <w:tc>
+          <w:tcPr>
+            <w:tcW w:type="dxa" w:w="1921"/>
+            <w:shd w:fill="EFF6FF"/>
+            <w:tcMar>
+              <w:top w:w="100" w:type="dxa"/>
+              <w:bottom w:w="100" w:type="dxa"/>
+              <w:left w:w="100" w:type="dxa"/>
+              <w:right w:w="100" w:type="dxa"/>
+            </w:tcMar>
+          </w:tcPr>
+          <w:p>
+            <w:r>
+              <w:rPr>
+                <w:b/>
+                <w:color w:val="1E3A8A"/>
+                <w:sz w:val="19"/>
+              </w:rPr>
+              <w:t>TỔNG CỘNG KINH PHÍ TƯ VẤN TRIỂN KHAI (TRỌN GÓI):</w:t>
+            </w:r>
+          </w:p>
+        </w:tc>
+        <w:tc>
+          <w:tcPr>
+            <w:tcW w:type="dxa" w:w="1921"/>
+            <w:shd w:fill="EFF6FF"/>
+            <w:tcMar>
+              <w:top w:w="100" w:type="dxa"/>
+              <w:bottom w:w="100" w:type="dxa"/>
+              <w:left w:w="100" w:type="dxa"/>
+              <w:right w:w="100" w:type="dxa"/>
+            </w:tcMar>
+          </w:tcPr>
+          <w:p/>
+        </w:tc>
+        <w:tc>
+          <w:tcPr>
+            <w:tcW w:type="dxa" w:w="1921"/>
+            <w:shd w:fill="EFF6FF"/>
+            <w:tcMar>
+              <w:top w:w="100" w:type="dxa"/>
+              <w:bottom w:w="100" w:type="dxa"/>
+              <w:left w:w="100" w:type="dxa"/>
+              <w:right w:w="100" w:type="dxa"/>
+            </w:tcMar>
+          </w:tcPr>
+          <w:p/>
+        </w:tc>
+        <w:tc>
+          <w:tcPr>
+            <w:tcW w:type="dxa" w:w="1921"/>
+            <w:shd w:fill="EFF6FF"/>
+            <w:tcMar>
+              <w:top w:w="100" w:type="dxa"/>
+              <w:bottom w:w="100" w:type="dxa"/>
+              <w:left w:w="100" w:type="dxa"/>
+              <w:right w:w="100" w:type="dxa"/>
+            </w:tcMar>
+          </w:tcPr>
+          <w:p>
+            <w:pPr>
+              <w:jc w:val="right"/>
+            </w:pPr>
+            <w:r>
+              <w:rPr>
+                <w:b/>
+                <w:color w:val="DC2626"/>
+                <w:sz w:val="22"/>
+              </w:rPr>
+              <w:t>15.000.000 đ</w:t>
+            </w:r>
+          </w:p>
+        </w:tc>
+      </w:tr>
+    </w:tbl>
+    <w:p>
+      <w:pPr>
+        <w:spacing w:after="80" w:line="276" w:lineRule="auto"/>
+      </w:pPr>
+      <w:r>
+        <w:rPr>
+          <w:i/>
+          <w:color w:val="0F172A"/>
+          <w:sz w:val="20"/>
+        </w:rPr>
+        <w:t>(Bằng chữ: Mười lăm triệu đồng chẵn. Đơn giá trên đã bao gồm toàn bộ chi phí khảo sát, cấu hình, chuyển đổi dữ liệu và đào tạo chuyển giao tại đơn vị.)</w:t>
+      </w:r>
+    </w:p>
+    <w:p>
+      <w:pPr>
+        <w:spacing w:after="80" w:line="276" w:lineRule="auto"/>
+      </w:pPr>
+      <w:r>
+        <w:rPr>
+          <w:b/>
+          <w:color w:val="1E3A8A"/>
+          <w:sz w:val="20"/>
+        </w:rPr>
+        <w:t xml:space="preserve">• </w:t>
+      </w:r>
+      <w:r>
+        <w:rPr>
+          <w:i w:val="0"/>
+          <w:color w:val="0F172A"/>
+          <w:sz w:val="20"/>
+        </w:rPr>
+        <w:t>Tiến độ thanh toán hợp đồng:</w:t>
+      </w:r>
+    </w:p>
+    <w:p>
+      <w:pPr>
+        <w:spacing w:after="80" w:line="276" w:lineRule="auto"/>
+      </w:pPr>
+      <w:r>
+        <w:rPr>
+          <w:i w:val="0"/>
+          <w:color w:val="0F172A"/>
+          <w:sz w:val="20"/>
+        </w:rPr>
+        <w:t>Đợt 1 (50% tương đương 7.500.000 VNĐ): Tạm ứng ngay sau khi ký kết hợp đồng tư vấn và bắt đầu tiếp nhận dữ liệu Excel từ xí nghiệp.</w:t>
+      </w:r>
+    </w:p>
+    <w:p>
+      <w:pPr>
+        <w:spacing w:after="80" w:line="276" w:lineRule="auto"/>
+      </w:pPr>
+      <w:r>
+        <w:rPr>
+          <w:i w:val="0"/>
+          <w:color w:val="0F172A"/>
+          <w:sz w:val="20"/>
+        </w:rPr>
+        <w:t>Đợt 2 (50% tương đương 7.500.000 VNĐ): Quyết toán sau khi hoàn thành công tác đào tạo UAT, nghiệm thu vận hành thử nghiệm và ký biên bản bàn giao chính thức.</w:t>
+      </w:r>
+    </w:p>
+    <w:p>
+      <w:pPr>
+        <w:spacing w:after="80" w:line="276" w:lineRule="auto"/>
+      </w:pPr>
+      <w:r>
+        <w:rPr>
+          <w:i w:val="0"/>
+          <w:color w:val="0F172A"/>
+          <w:sz w:val="20"/>
+        </w:rPr>
+        <w:t>Cam kết kinh phí: Mức kinh phí 15.000.000 VNĐ là chi phí trọn gói chìa khóa trao tay. Bên tư vấn cam kết không phát sinh bất kỳ khoản phụ phí nào ngoài hợp đồng trong suốt quá trình triển khai.</w:t>
+      </w:r>
+    </w:p>
+    <w:p>
+      <w:pPr>
+        <w:spacing w:before="240" w:after="120"/>
+      </w:pPr>
+      <w:r>
+        <w:rPr>
+          <w:rFonts w:ascii="Calibri" w:hAnsi="Calibri"/>
+          <w:b/>
+          <w:color w:val="0284C7"/>
+          <w:sz w:val="24"/>
+        </w:rPr>
+        <w:t>3. Cam kết chất lượng, bảo mật &amp; hỗ trợ kỹ thuật</w:t>
       </w:r>
     </w:p>
     <w:p>

</xml_diff>

<commit_message>
docs: Cap nhat dai dien don vi thu huong thanh Doan Thi Nhung trong chu ky va thong tin thuyet minh Word va PDF
</commit_message>
<xml_diff>
--- a/QAROMI_ERP_Thuyet_Minh_Giai_Phap.docx
+++ b/QAROMI_ERP_Thuyet_Minh_Giai_Phap.docx
@@ -102,6 +102,51 @@
                 <w:sz w:val="19"/>
               </w:rPr>
               <w:t>Xí nghiệp Nước Hòn Gai — Công ty CP Nước sạch Quảng Ninh (QUAWACO)</w:t>
+            </w:r>
+          </w:p>
+        </w:tc>
+      </w:tr>
+      <w:tr>
+        <w:tc>
+          <w:tcPr>
+            <w:tcW w:type="dxa" w:w="4802"/>
+            <w:shd w:fill="F1F5F9"/>
+            <w:tcMar>
+              <w:top w:w="80" w:type="dxa"/>
+              <w:bottom w:w="80" w:type="dxa"/>
+              <w:left w:w="120" w:type="dxa"/>
+              <w:right w:w="120" w:type="dxa"/>
+            </w:tcMar>
+          </w:tcPr>
+          <w:p>
+            <w:r>
+              <w:rPr>
+                <w:b/>
+                <w:color w:val="1E3A8A"/>
+                <w:sz w:val="19"/>
+              </w:rPr>
+              <w:t>Đại diện đơn vị:</w:t>
+            </w:r>
+          </w:p>
+        </w:tc>
+        <w:tc>
+          <w:tcPr>
+            <w:tcW w:type="dxa" w:w="4802"/>
+            <w:shd w:fill="F8FAFC"/>
+            <w:tcMar>
+              <w:top w:w="80" w:type="dxa"/>
+              <w:bottom w:w="80" w:type="dxa"/>
+              <w:left w:w="120" w:type="dxa"/>
+              <w:right w:w="120" w:type="dxa"/>
+            </w:tcMar>
+          </w:tcPr>
+          <w:p>
+            <w:r>
+              <w:rPr>
+                <w:color w:val="0F172A"/>
+                <w:sz w:val="19"/>
+              </w:rPr>
+              <w:t>Đoàn Thị Nhung — Xí nghiệp Nước Hòn Gai</w:t>
             </w:r>
           </w:p>
         </w:tc>
@@ -327,7 +372,7 @@
                 <w:color w:val="0F172A"/>
                 <w:sz w:val="19"/>
               </w:rPr>
-              <w:t>Phiên bản 2.1.0 — Bản Trình Duyệt Chốt Phương Án (Kèm 23 ảnh minh chứng &amp; Dự toán)</w:t>
+              <w:t>Phiên bản 2.2.0 — Bản Trình Duyệt Chốt Phương Án (Kèm 23 ảnh minh chứng &amp; Dự toán)</w:t>
             </w:r>
           </w:p>
         </w:tc>
@@ -4667,7 +4712,7 @@
                 <w:color w:val="0F172A"/>
                 <w:sz w:val="22"/>
               </w:rPr>
-              <w:t>BAN GIÁM ĐỐC XÍ NGHIỆP</w:t>
+              <w:t>Đoàn Thị Nhung</w:t>
             </w:r>
           </w:p>
         </w:tc>

</xml_diff>

<commit_message>
docs: Co gon bang du toan kinh phi 15 trieu thanh hop tom tat tron goi trang nha
</commit_message>
<xml_diff>
--- a/QAROMI_ERP_Thuyet_Minh_Giai_Phap.docx
+++ b/QAROMI_ERP_Thuyet_Minh_Giai_Phap.docx
@@ -3771,20 +3771,7 @@
           <w:color w:val="0284C7"/>
           <w:sz w:val="24"/>
         </w:rPr>
-        <w:t>2. Dự toán kinh phí tư vấn và triển khai giải pháp (15.000.000 VNĐ)</w:t>
-      </w:r>
-    </w:p>
-    <w:p>
-      <w:pPr>
-        <w:spacing w:after="80" w:line="276" w:lineRule="auto"/>
-      </w:pPr>
-      <w:r>
-        <w:rPr>
-          <w:i w:val="0"/>
-          <w:color w:val="0F172A"/>
-          <w:sz w:val="20"/>
-        </w:rPr>
-        <w:t>Chi phí tư vấn và triển khai phần mềm Quản trị doanh nghiệp QAROMI ERP được xây dựng theo hình thức trọn gói chìa khóa trao tay, bảo đảm tối ưu ngân sách cho xí nghiệp và tuyệt đối không phát sinh chi phí ẩn:</w:t>
+        <w:t>2. Kinh phí tư vấn và triển khai giải pháp (Trọn gói: 15.000.000 VNĐ)</w:t>
       </w:r>
     </w:p>
     <w:tbl>
@@ -3795,763 +3782,118 @@
         <w:tblLook w:firstColumn="1" w:firstRow="1" w:lastColumn="0" w:lastRow="0" w:noHBand="0" w:noVBand="1" w:val="04A0"/>
       </w:tblPr>
       <w:tblGrid>
-        <w:gridCol w:w="864"/>
-        <w:gridCol w:w="3744"/>
-        <w:gridCol w:w="2592"/>
-        <w:gridCol w:w="864"/>
-        <w:gridCol w:w="1728"/>
+        <w:gridCol w:w="9792"/>
       </w:tblGrid>
       <w:tr>
         <w:tc>
           <w:tcPr>
-            <w:tcW w:type="dxa" w:w="1921"/>
-            <w:shd w:fill="1E3A8A"/>
+            <w:tcW w:type="dxa" w:w="9605"/>
+            <w:shd w:fill="EFF6FF"/>
             <w:tcMar>
-              <w:top w:w="100" w:type="dxa"/>
-              <w:bottom w:w="100" w:type="dxa"/>
-              <w:left w:w="100" w:type="dxa"/>
-              <w:right w:w="100" w:type="dxa"/>
+              <w:top w:w="120" w:type="dxa"/>
+              <w:bottom w:w="120" w:type="dxa"/>
+              <w:left w:w="160" w:type="dxa"/>
+              <w:right w:w="160" w:type="dxa"/>
             </w:tcMar>
+            <w:tcBorders>
+              <w:top w:val="single" w:sz="8" w:space="0" w:color="93C5FD"/>
+              <w:left w:val="single" w:sz="24" w:space="0" w:color="1E3A8A"/>
+              <w:bottom w:val="single" w:sz="8" w:space="0" w:color="93C5FD"/>
+              <w:right w:val="single" w:sz="8" w:space="0" w:color="93C5FD"/>
+            </w:tcBorders>
           </w:tcPr>
           <w:p>
             <w:pPr>
-              <w:jc w:val="center"/>
-            </w:pPr>
-            <w:r>
-              <w:rPr>
-                <w:b/>
-                <w:color w:val="FFFFFF"/>
-                <w:sz w:val="18"/>
-              </w:rPr>
-              <w:t>STT</w:t>
-            </w:r>
-          </w:p>
-        </w:tc>
-        <w:tc>
-          <w:tcPr>
-            <w:tcW w:type="dxa" w:w="1921"/>
-            <w:shd w:fill="1E3A8A"/>
-            <w:tcMar>
-              <w:top w:w="100" w:type="dxa"/>
-              <w:bottom w:w="100" w:type="dxa"/>
-              <w:left w:w="100" w:type="dxa"/>
-              <w:right w:w="100" w:type="dxa"/>
-            </w:tcMar>
-          </w:tcPr>
-          <w:p>
-            <w:r>
-              <w:rPr>
-                <w:b/>
-                <w:color w:val="FFFFFF"/>
-                <w:sz w:val="18"/>
-              </w:rPr>
-              <w:t>Hạng mục công việc tư vấn &amp; triển khai</w:t>
-            </w:r>
-          </w:p>
-        </w:tc>
-        <w:tc>
-          <w:tcPr>
-            <w:tcW w:type="dxa" w:w="1921"/>
-            <w:shd w:fill="1E3A8A"/>
-            <w:tcMar>
-              <w:top w:w="100" w:type="dxa"/>
-              <w:bottom w:w="100" w:type="dxa"/>
-              <w:left w:w="100" w:type="dxa"/>
-              <w:right w:w="100" w:type="dxa"/>
-            </w:tcMar>
-          </w:tcPr>
-          <w:p>
-            <w:r>
-              <w:rPr>
-                <w:b/>
-                <w:color w:val="FFFFFF"/>
-                <w:sz w:val="18"/>
-              </w:rPr>
-              <w:t>Phạm vi thực hiện</w:t>
-            </w:r>
-          </w:p>
-        </w:tc>
-        <w:tc>
-          <w:tcPr>
-            <w:tcW w:type="dxa" w:w="1921"/>
-            <w:shd w:fill="1E3A8A"/>
-            <w:tcMar>
-              <w:top w:w="100" w:type="dxa"/>
-              <w:bottom w:w="100" w:type="dxa"/>
-              <w:left w:w="100" w:type="dxa"/>
-              <w:right w:w="100" w:type="dxa"/>
-            </w:tcMar>
-          </w:tcPr>
-          <w:p>
-            <w:pPr>
-              <w:jc w:val="center"/>
-            </w:pPr>
-            <w:r>
-              <w:rPr>
-                <w:b/>
-                <w:color w:val="FFFFFF"/>
-                <w:sz w:val="18"/>
-              </w:rPr>
-              <w:t>ĐVT</w:t>
-            </w:r>
-          </w:p>
-        </w:tc>
-        <w:tc>
-          <w:tcPr>
-            <w:tcW w:type="dxa" w:w="1921"/>
-            <w:shd w:fill="1E3A8A"/>
-            <w:tcMar>
-              <w:top w:w="100" w:type="dxa"/>
-              <w:bottom w:w="100" w:type="dxa"/>
-              <w:left w:w="100" w:type="dxa"/>
-              <w:right w:w="100" w:type="dxa"/>
-            </w:tcMar>
-          </w:tcPr>
-          <w:p>
-            <w:pPr>
-              <w:jc w:val="right"/>
-            </w:pPr>
-            <w:r>
-              <w:rPr>
-                <w:b/>
-                <w:color w:val="FFFFFF"/>
-                <w:sz w:val="18"/>
-              </w:rPr>
-              <w:t>Thành tiền (VNĐ)</w:t>
-            </w:r>
-          </w:p>
-        </w:tc>
-      </w:tr>
-      <w:tr>
-        <w:tc>
-          <w:tcPr>
-            <w:tcW w:type="dxa" w:w="1921"/>
-            <w:shd w:fill="F8FAFC"/>
-            <w:tcMar>
-              <w:top w:w="80" w:type="dxa"/>
-              <w:bottom w:w="80" w:type="dxa"/>
-              <w:left w:w="100" w:type="dxa"/>
-              <w:right w:w="100" w:type="dxa"/>
-            </w:tcMar>
-          </w:tcPr>
-          <w:p>
-            <w:pPr>
-              <w:jc w:val="center"/>
-            </w:pPr>
-            <w:r>
-              <w:rPr>
-                <w:color w:val="0F172A"/>
-                <w:sz w:val="18"/>
-              </w:rPr>
-              <w:t>1</w:t>
-            </w:r>
-          </w:p>
-        </w:tc>
-        <w:tc>
-          <w:tcPr>
-            <w:tcW w:type="dxa" w:w="1921"/>
-            <w:shd w:fill="F8FAFC"/>
-            <w:tcMar>
-              <w:top w:w="80" w:type="dxa"/>
-              <w:bottom w:w="80" w:type="dxa"/>
-              <w:left w:w="100" w:type="dxa"/>
-              <w:right w:w="100" w:type="dxa"/>
-            </w:tcMar>
-          </w:tcPr>
-          <w:p>
-            <w:r>
-              <w:rPr>
-                <w:color w:val="0F172A"/>
-                <w:sz w:val="18"/>
-              </w:rPr>
-              <w:t>Khảo sát hiện trạng &amp; Chuẩn hóa dữ liệu Master Data từ Excel</w:t>
-            </w:r>
-          </w:p>
-        </w:tc>
-        <w:tc>
-          <w:tcPr>
-            <w:tcW w:type="dxa" w:w="1921"/>
-            <w:shd w:fill="F8FAFC"/>
-            <w:tcMar>
-              <w:top w:w="80" w:type="dxa"/>
-              <w:bottom w:w="80" w:type="dxa"/>
-              <w:left w:w="100" w:type="dxa"/>
-              <w:right w:w="100" w:type="dxa"/>
-            </w:tcMar>
-          </w:tcPr>
-          <w:p>
-            <w:r>
-              <w:rPr>
-                <w:color w:val="0F172A"/>
-                <w:sz w:val="18"/>
-              </w:rPr>
-              <w:t>Bóc tách 13 sheets dữ liệu thực tế, xử lý triệt để 12 lỗi #REF!, làm sạch danh bạ 411 khách hàng, 202 CBCNV, 5 kho bãi</w:t>
-            </w:r>
-          </w:p>
-        </w:tc>
-        <w:tc>
-          <w:tcPr>
-            <w:tcW w:type="dxa" w:w="1921"/>
-            <w:shd w:fill="F8FAFC"/>
-            <w:tcMar>
-              <w:top w:w="80" w:type="dxa"/>
-              <w:bottom w:w="80" w:type="dxa"/>
-              <w:left w:w="100" w:type="dxa"/>
-              <w:right w:w="100" w:type="dxa"/>
-            </w:tcMar>
-          </w:tcPr>
-          <w:p>
-            <w:pPr>
-              <w:jc w:val="center"/>
-            </w:pPr>
-            <w:r>
-              <w:rPr>
-                <w:color w:val="0F172A"/>
-                <w:sz w:val="18"/>
-              </w:rPr>
-              <w:t>Gói</w:t>
-            </w:r>
-          </w:p>
-        </w:tc>
-        <w:tc>
-          <w:tcPr>
-            <w:tcW w:type="dxa" w:w="1921"/>
-            <w:shd w:fill="F8FAFC"/>
-            <w:tcMar>
-              <w:top w:w="80" w:type="dxa"/>
-              <w:bottom w:w="80" w:type="dxa"/>
-              <w:left w:w="100" w:type="dxa"/>
-              <w:right w:w="100" w:type="dxa"/>
-            </w:tcMar>
-          </w:tcPr>
-          <w:p>
-            <w:pPr>
-              <w:jc w:val="right"/>
+              <w:spacing w:after="120"/>
             </w:pPr>
             <w:r>
               <w:rPr>
                 <w:b/>
                 <w:color w:val="1E3A8A"/>
-                <w:sz w:val="18"/>
+                <w:sz w:val="22"/>
               </w:rPr>
-              <w:t>3.500.000</w:t>
+              <w:t xml:space="preserve">TỔNG KINH PHÍ TƯ VẤN &amp; TRIỂN KHAI TRỌN GÓI:  </w:t>
             </w:r>
-          </w:p>
-        </w:tc>
-      </w:tr>
-      <w:tr>
-        <w:tc>
-          <w:tcPr>
-            <w:tcW w:type="dxa" w:w="1921"/>
-            <w:shd w:fill="FFFFFF"/>
-            <w:tcMar>
-              <w:top w:w="80" w:type="dxa"/>
-              <w:bottom w:w="80" w:type="dxa"/>
-              <w:left w:w="100" w:type="dxa"/>
-              <w:right w:w="100" w:type="dxa"/>
-            </w:tcMar>
-          </w:tcPr>
-          <w:p>
-            <w:pPr>
-              <w:jc w:val="center"/>
-            </w:pPr>
-            <w:r>
-              <w:rPr>
-                <w:color w:val="0F172A"/>
-                <w:sz w:val="18"/>
-              </w:rPr>
-              <w:t>2</w:t>
-            </w:r>
-          </w:p>
-        </w:tc>
-        <w:tc>
-          <w:tcPr>
-            <w:tcW w:type="dxa" w:w="1921"/>
-            <w:shd w:fill="FFFFFF"/>
-            <w:tcMar>
-              <w:top w:w="80" w:type="dxa"/>
-              <w:bottom w:w="80" w:type="dxa"/>
-              <w:left w:w="100" w:type="dxa"/>
-              <w:right w:w="100" w:type="dxa"/>
-            </w:tcMar>
-          </w:tcPr>
-          <w:p>
-            <w:r>
-              <w:rPr>
-                <w:color w:val="0F172A"/>
-                <w:sz w:val="18"/>
-              </w:rPr>
-              <w:t>Cài đặt hệ thống lõi &amp; Cấu hình 23 phân hệ QAROMI ERP</w:t>
-            </w:r>
-          </w:p>
-        </w:tc>
-        <w:tc>
-          <w:tcPr>
-            <w:tcW w:type="dxa" w:w="1921"/>
-            <w:shd w:fill="FFFFFF"/>
-            <w:tcMar>
-              <w:top w:w="80" w:type="dxa"/>
-              <w:bottom w:w="80" w:type="dxa"/>
-              <w:left w:w="100" w:type="dxa"/>
-              <w:right w:w="100" w:type="dxa"/>
-            </w:tcMar>
-          </w:tcPr>
-          <w:p>
-            <w:r>
-              <w:rPr>
-                <w:color w:val="0F172A"/>
-                <w:sz w:val="18"/>
-              </w:rPr>
-              <w:t>Thiết lập CSDL quan hệ ACID, đóng gói logic tự động trừ kho, công thức chia đều thù lao vận chuyển, tách VAT 8%, sổ nợ vỏ 19L</w:t>
-            </w:r>
-          </w:p>
-        </w:tc>
-        <w:tc>
-          <w:tcPr>
-            <w:tcW w:type="dxa" w:w="1921"/>
-            <w:shd w:fill="FFFFFF"/>
-            <w:tcMar>
-              <w:top w:w="80" w:type="dxa"/>
-              <w:bottom w:w="80" w:type="dxa"/>
-              <w:left w:w="100" w:type="dxa"/>
-              <w:right w:w="100" w:type="dxa"/>
-            </w:tcMar>
-          </w:tcPr>
-          <w:p>
-            <w:pPr>
-              <w:jc w:val="center"/>
-            </w:pPr>
-            <w:r>
-              <w:rPr>
-                <w:color w:val="0F172A"/>
-                <w:sz w:val="18"/>
-              </w:rPr>
-              <w:t>Gói</w:t>
-            </w:r>
-          </w:p>
-        </w:tc>
-        <w:tc>
-          <w:tcPr>
-            <w:tcW w:type="dxa" w:w="1921"/>
-            <w:shd w:fill="FFFFFF"/>
-            <w:tcMar>
-              <w:top w:w="80" w:type="dxa"/>
-              <w:bottom w:w="80" w:type="dxa"/>
-              <w:left w:w="100" w:type="dxa"/>
-              <w:right w:w="100" w:type="dxa"/>
-            </w:tcMar>
-          </w:tcPr>
-          <w:p>
-            <w:pPr>
-              <w:jc w:val="right"/>
-            </w:pPr>
             <w:r>
               <w:rPr>
                 <w:b/>
-                <w:color w:val="1E3A8A"/>
-                <w:sz w:val="18"/>
+                <w:color w:val="DC2626"/>
+                <w:sz w:val="26"/>
               </w:rPr>
-              <w:t>5.500.000</w:t>
+              <w:t>15.000.000 VNĐ</w:t>
+            </w:r>
+            <w:r>
+              <w:rPr>
+                <w:i/>
+                <w:color w:val="0F172A"/>
+                <w:sz w:val="19"/>
+              </w:rPr>
+              <w:t xml:space="preserve">  (Mười lăm triệu đồng chẵn)</w:t>
             </w:r>
           </w:p>
-        </w:tc>
-      </w:tr>
-      <w:tr>
-        <w:tc>
-          <w:tcPr>
-            <w:tcW w:type="dxa" w:w="1921"/>
-            <w:shd w:fill="F8FAFC"/>
-            <w:tcMar>
-              <w:top w:w="80" w:type="dxa"/>
-              <w:bottom w:w="80" w:type="dxa"/>
-              <w:left w:w="100" w:type="dxa"/>
-              <w:right w:w="100" w:type="dxa"/>
-            </w:tcMar>
-          </w:tcPr>
           <w:p>
             <w:pPr>
-              <w:jc w:val="center"/>
+              <w:spacing w:after="60"/>
             </w:pPr>
-            <w:r>
-              <w:rPr>
-                <w:color w:val="0F172A"/>
-                <w:sz w:val="18"/>
-              </w:rPr>
-              <w:t>3</w:t>
-            </w:r>
-          </w:p>
-        </w:tc>
-        <w:tc>
-          <w:tcPr>
-            <w:tcW w:type="dxa" w:w="1921"/>
-            <w:shd w:fill="F8FAFC"/>
-            <w:tcMar>
-              <w:top w:w="80" w:type="dxa"/>
-              <w:bottom w:w="80" w:type="dxa"/>
-              <w:left w:w="100" w:type="dxa"/>
-              <w:right w:w="100" w:type="dxa"/>
-            </w:tcMar>
-          </w:tcPr>
-          <w:p>
-            <w:r>
-              <w:rPr>
-                <w:color w:val="0F172A"/>
-                <w:sz w:val="18"/>
-              </w:rPr>
-              <w:t>Đào tạo chuyển giao công nghệ &amp; Vận hành thử nghiệm (UAT)</w:t>
-            </w:r>
-          </w:p>
-        </w:tc>
-        <w:tc>
-          <w:tcPr>
-            <w:tcW w:type="dxa" w:w="1921"/>
-            <w:shd w:fill="F8FAFC"/>
-            <w:tcMar>
-              <w:top w:w="80" w:type="dxa"/>
-              <w:bottom w:w="80" w:type="dxa"/>
-              <w:left w:w="100" w:type="dxa"/>
-              <w:right w:w="100" w:type="dxa"/>
-            </w:tcMar>
-          </w:tcPr>
-          <w:p>
-            <w:r>
-              <w:rPr>
-                <w:color w:val="0F172A"/>
-                <w:sz w:val="18"/>
-              </w:rPr>
-              <w:t>Đào tạo thực chiến Ban Giám đốc, Kế toán, Thủ kho, Tiếp thị, Tài xế xe tải điện; hỗ trợ chạy song song 14 ngày</w:t>
-            </w:r>
-          </w:p>
-        </w:tc>
-        <w:tc>
-          <w:tcPr>
-            <w:tcW w:type="dxa" w:w="1921"/>
-            <w:shd w:fill="F8FAFC"/>
-            <w:tcMar>
-              <w:top w:w="80" w:type="dxa"/>
-              <w:bottom w:w="80" w:type="dxa"/>
-              <w:left w:w="100" w:type="dxa"/>
-              <w:right w:w="100" w:type="dxa"/>
-            </w:tcMar>
-          </w:tcPr>
-          <w:p>
-            <w:pPr>
-              <w:jc w:val="center"/>
-            </w:pPr>
-            <w:r>
-              <w:rPr>
-                <w:color w:val="0F172A"/>
-                <w:sz w:val="18"/>
-              </w:rPr>
-              <w:t>Gói</w:t>
-            </w:r>
-          </w:p>
-        </w:tc>
-        <w:tc>
-          <w:tcPr>
-            <w:tcW w:type="dxa" w:w="1921"/>
-            <w:shd w:fill="F8FAFC"/>
-            <w:tcMar>
-              <w:top w:w="80" w:type="dxa"/>
-              <w:bottom w:w="80" w:type="dxa"/>
-              <w:left w:w="100" w:type="dxa"/>
-              <w:right w:w="100" w:type="dxa"/>
-            </w:tcMar>
-          </w:tcPr>
-          <w:p>
-            <w:pPr>
-              <w:jc w:val="right"/>
-            </w:pPr>
-            <w:r>
-              <w:rPr>
-                <w:b/>
-                <w:color w:val="1E3A8A"/>
-                <w:sz w:val="18"/>
-              </w:rPr>
-              <w:t>3.500.000</w:t>
-            </w:r>
-          </w:p>
-        </w:tc>
-      </w:tr>
-      <w:tr>
-        <w:tc>
-          <w:tcPr>
-            <w:tcW w:type="dxa" w:w="1921"/>
-            <w:shd w:fill="FFFFFF"/>
-            <w:tcMar>
-              <w:top w:w="80" w:type="dxa"/>
-              <w:bottom w:w="80" w:type="dxa"/>
-              <w:left w:w="100" w:type="dxa"/>
-              <w:right w:w="100" w:type="dxa"/>
-            </w:tcMar>
-          </w:tcPr>
-          <w:p>
-            <w:pPr>
-              <w:jc w:val="center"/>
-            </w:pPr>
-            <w:r>
-              <w:rPr>
-                <w:color w:val="0F172A"/>
-                <w:sz w:val="18"/>
-              </w:rPr>
-              <w:t>4</w:t>
-            </w:r>
-          </w:p>
-        </w:tc>
-        <w:tc>
-          <w:tcPr>
-            <w:tcW w:type="dxa" w:w="1921"/>
-            <w:shd w:fill="FFFFFF"/>
-            <w:tcMar>
-              <w:top w:w="80" w:type="dxa"/>
-              <w:bottom w:w="80" w:type="dxa"/>
-              <w:left w:w="100" w:type="dxa"/>
-              <w:right w:w="100" w:type="dxa"/>
-            </w:tcMar>
-          </w:tcPr>
-          <w:p>
-            <w:r>
-              <w:rPr>
-                <w:color w:val="0F172A"/>
-                <w:sz w:val="18"/>
-              </w:rPr>
-              <w:t>Bảo hành, bảo trì &amp; Hỗ trợ kỹ thuật sau Golive (06 tháng)</w:t>
-            </w:r>
-          </w:p>
-        </w:tc>
-        <w:tc>
-          <w:tcPr>
-            <w:tcW w:type="dxa" w:w="1921"/>
-            <w:shd w:fill="FFFFFF"/>
-            <w:tcMar>
-              <w:top w:w="80" w:type="dxa"/>
-              <w:bottom w:w="80" w:type="dxa"/>
-              <w:left w:w="100" w:type="dxa"/>
-              <w:right w:w="100" w:type="dxa"/>
-            </w:tcMar>
-          </w:tcPr>
-          <w:p>
-            <w:r>
-              <w:rPr>
-                <w:color w:val="0F172A"/>
-                <w:sz w:val="18"/>
-              </w:rPr>
-              <w:t>Trực hỗ trợ kỹ thuật 24/7, định kỳ sao lưu dữ liệu, bảo đảm hệ thống vận hành thông suốt, chuyển giao tài liệu kỹ thuật</w:t>
-            </w:r>
-          </w:p>
-        </w:tc>
-        <w:tc>
-          <w:tcPr>
-            <w:tcW w:type="dxa" w:w="1921"/>
-            <w:shd w:fill="FFFFFF"/>
-            <w:tcMar>
-              <w:top w:w="80" w:type="dxa"/>
-              <w:bottom w:w="80" w:type="dxa"/>
-              <w:left w:w="100" w:type="dxa"/>
-              <w:right w:w="100" w:type="dxa"/>
-            </w:tcMar>
-          </w:tcPr>
-          <w:p>
-            <w:pPr>
-              <w:jc w:val="center"/>
-            </w:pPr>
-            <w:r>
-              <w:rPr>
-                <w:color w:val="0F172A"/>
-                <w:sz w:val="18"/>
-              </w:rPr>
-              <w:t>Gói</w:t>
-            </w:r>
-          </w:p>
-        </w:tc>
-        <w:tc>
-          <w:tcPr>
-            <w:tcW w:type="dxa" w:w="1921"/>
-            <w:shd w:fill="FFFFFF"/>
-            <w:tcMar>
-              <w:top w:w="80" w:type="dxa"/>
-              <w:bottom w:w="80" w:type="dxa"/>
-              <w:left w:w="100" w:type="dxa"/>
-              <w:right w:w="100" w:type="dxa"/>
-            </w:tcMar>
-          </w:tcPr>
-          <w:p>
-            <w:pPr>
-              <w:jc w:val="right"/>
-            </w:pPr>
-            <w:r>
-              <w:rPr>
-                <w:b/>
-                <w:color w:val="1E3A8A"/>
-                <w:sz w:val="18"/>
-              </w:rPr>
-              <w:t>2.500.000</w:t>
-            </w:r>
-          </w:p>
-        </w:tc>
-      </w:tr>
-      <w:tr>
-        <w:tc>
-          <w:tcPr>
-            <w:tcW w:type="dxa" w:w="1921"/>
-            <w:shd w:fill="EFF6FF"/>
-            <w:tcMar>
-              <w:top w:w="100" w:type="dxa"/>
-              <w:bottom w:w="100" w:type="dxa"/>
-              <w:left w:w="100" w:type="dxa"/>
-              <w:right w:w="100" w:type="dxa"/>
-            </w:tcMar>
-          </w:tcPr>
-          <w:p/>
-        </w:tc>
-        <w:tc>
-          <w:tcPr>
-            <w:tcW w:type="dxa" w:w="1921"/>
-            <w:shd w:fill="EFF6FF"/>
-            <w:tcMar>
-              <w:top w:w="100" w:type="dxa"/>
-              <w:bottom w:w="100" w:type="dxa"/>
-              <w:left w:w="100" w:type="dxa"/>
-              <w:right w:w="100" w:type="dxa"/>
-            </w:tcMar>
-          </w:tcPr>
-          <w:p>
             <w:r>
               <w:rPr>
                 <w:b/>
                 <w:color w:val="1E3A8A"/>
                 <w:sz w:val="19"/>
               </w:rPr>
-              <w:t>TỔNG CỘNG KINH PHÍ TƯ VẤN TRIỂN KHAI (TRỌN GÓI):</w:t>
+              <w:t xml:space="preserve">• Phạm vi thực hiện trọn gói: </w:t>
+            </w:r>
+            <w:r>
+              <w:rPr>
+                <w:color w:val="0F172A"/>
+                <w:sz w:val="19"/>
+              </w:rPr>
+              <w:t>Chuẩn hóa toàn diện Master Data từ Excel cũ (xử lý triệt để 12 lỗi #REF!), cài đặt hệ thống lõi &amp; cấu hình đầy đủ 23 phân hệ, đào tạo chuyển giao UAT thực chiến và bảo hành bảo trì kỹ thuật 06 tháng sau Golive.</w:t>
             </w:r>
           </w:p>
-        </w:tc>
-        <w:tc>
-          <w:tcPr>
-            <w:tcW w:type="dxa" w:w="1921"/>
-            <w:shd w:fill="EFF6FF"/>
-            <w:tcMar>
-              <w:top w:w="100" w:type="dxa"/>
-              <w:bottom w:w="100" w:type="dxa"/>
-              <w:left w:w="100" w:type="dxa"/>
-              <w:right w:w="100" w:type="dxa"/>
-            </w:tcMar>
-          </w:tcPr>
-          <w:p/>
-        </w:tc>
-        <w:tc>
-          <w:tcPr>
-            <w:tcW w:type="dxa" w:w="1921"/>
-            <w:shd w:fill="EFF6FF"/>
-            <w:tcMar>
-              <w:top w:w="100" w:type="dxa"/>
-              <w:bottom w:w="100" w:type="dxa"/>
-              <w:left w:w="100" w:type="dxa"/>
-              <w:right w:w="100" w:type="dxa"/>
-            </w:tcMar>
-          </w:tcPr>
-          <w:p/>
-        </w:tc>
-        <w:tc>
-          <w:tcPr>
-            <w:tcW w:type="dxa" w:w="1921"/>
-            <w:shd w:fill="EFF6FF"/>
-            <w:tcMar>
-              <w:top w:w="100" w:type="dxa"/>
-              <w:bottom w:w="100" w:type="dxa"/>
-              <w:left w:w="100" w:type="dxa"/>
-              <w:right w:w="100" w:type="dxa"/>
-            </w:tcMar>
-          </w:tcPr>
           <w:p>
             <w:pPr>
-              <w:jc w:val="right"/>
+              <w:spacing w:after="60"/>
             </w:pPr>
             <w:r>
               <w:rPr>
                 <w:b/>
-                <w:color w:val="DC2626"/>
-                <w:sz w:val="22"/>
+                <w:color w:val="1E3A8A"/>
+                <w:sz w:val="19"/>
               </w:rPr>
-              <w:t>15.000.000 đ</w:t>
+              <w:t xml:space="preserve">• Tiến độ thanh toán (02 đợt): </w:t>
+            </w:r>
+            <w:r>
+              <w:rPr>
+                <w:color w:val="0F172A"/>
+                <w:sz w:val="19"/>
+              </w:rPr>
+              <w:t>Đợt 1 (50% = 7.500.000 VNĐ) tạm ứng khi ký hợp đồng và bàn giao dữ liệu; Đợt 2 (50% = 7.500.000 VNĐ) quyết toán sau khi hoàn thành đào tạo UAT và ký biên bản nghiệm thu.</w:t>
+            </w:r>
+          </w:p>
+          <w:p>
+            <w:pPr>
+              <w:spacing w:after="0"/>
+            </w:pPr>
+            <w:r>
+              <w:rPr>
+                <w:b/>
+                <w:color w:val="1E3A8A"/>
+                <w:sz w:val="19"/>
+              </w:rPr>
+              <w:t xml:space="preserve">• Cam kết chìa khóa trao tay: </w:t>
+            </w:r>
+            <w:r>
+              <w:rPr>
+                <w:color w:val="0F172A"/>
+                <w:sz w:val="19"/>
+              </w:rPr>
+              <w:t>Chi phí cố định trọn gói, bảo đảm 100% không phát sinh bất kỳ khoản phụ phí nào ngoài hợp đồng trong suốt quá trình triển khai.</w:t>
             </w:r>
           </w:p>
         </w:tc>
       </w:tr>
     </w:tbl>
-    <w:p>
-      <w:pPr>
-        <w:spacing w:after="80" w:line="276" w:lineRule="auto"/>
-      </w:pPr>
-      <w:r>
-        <w:rPr>
-          <w:i/>
-          <w:color w:val="0F172A"/>
-          <w:sz w:val="20"/>
-        </w:rPr>
-        <w:t>(Bằng chữ: Mười lăm triệu đồng chẵn. Đơn giá trên đã bao gồm toàn bộ chi phí khảo sát, cấu hình, chuyển đổi dữ liệu và đào tạo chuyển giao tại đơn vị.)</w:t>
-      </w:r>
-    </w:p>
-    <w:p>
-      <w:pPr>
-        <w:spacing w:after="80" w:line="276" w:lineRule="auto"/>
-      </w:pPr>
-      <w:r>
-        <w:rPr>
-          <w:b/>
-          <w:color w:val="1E3A8A"/>
-          <w:sz w:val="20"/>
-        </w:rPr>
-        <w:t xml:space="preserve">• </w:t>
-      </w:r>
-      <w:r>
-        <w:rPr>
-          <w:i w:val="0"/>
-          <w:color w:val="0F172A"/>
-          <w:sz w:val="20"/>
-        </w:rPr>
-        <w:t>Tiến độ thanh toán hợp đồng:</w:t>
-      </w:r>
-    </w:p>
-    <w:p>
-      <w:pPr>
-        <w:spacing w:after="80" w:line="276" w:lineRule="auto"/>
-      </w:pPr>
-      <w:r>
-        <w:rPr>
-          <w:i w:val="0"/>
-          <w:color w:val="0F172A"/>
-          <w:sz w:val="20"/>
-        </w:rPr>
-        <w:t>Đợt 1 (50% tương đương 7.500.000 VNĐ): Tạm ứng ngay sau khi ký kết hợp đồng tư vấn và bắt đầu tiếp nhận dữ liệu Excel từ xí nghiệp.</w:t>
-      </w:r>
-    </w:p>
-    <w:p>
-      <w:pPr>
-        <w:spacing w:after="80" w:line="276" w:lineRule="auto"/>
-      </w:pPr>
-      <w:r>
-        <w:rPr>
-          <w:i w:val="0"/>
-          <w:color w:val="0F172A"/>
-          <w:sz w:val="20"/>
-        </w:rPr>
-        <w:t>Đợt 2 (50% tương đương 7.500.000 VNĐ): Quyết toán sau khi hoàn thành công tác đào tạo UAT, nghiệm thu vận hành thử nghiệm và ký biên bản bàn giao chính thức.</w:t>
-      </w:r>
-    </w:p>
-    <w:p>
-      <w:pPr>
-        <w:spacing w:after="80" w:line="276" w:lineRule="auto"/>
-      </w:pPr>
-      <w:r>
-        <w:rPr>
-          <w:i w:val="0"/>
-          <w:color w:val="0F172A"/>
-          <w:sz w:val="20"/>
-        </w:rPr>
-        <w:t>Cam kết kinh phí: Mức kinh phí 15.000.000 VNĐ là chi phí trọn gói chìa khóa trao tay. Bên tư vấn cam kết không phát sinh bất kỳ khoản phụ phí nào ngoài hợp đồng trong suốt quá trình triển khai.</w:t>
-      </w:r>
-    </w:p>
     <w:p>
       <w:pPr>
         <w:spacing w:before="240" w:after="120"/>

</xml_diff>